<commit_message>
Jobs updates - logs and MyFactSheet.pdf
</commit_message>
<xml_diff>
--- a/assets/pdf/2026_DroneFactSheet.docx
+++ b/assets/pdf/2026_DroneFactSheet.docx
@@ -1039,6 +1039,7 @@
       <w:tblPr>
         <w:tblStyle w:val="TableGrid"/>
         <w:tblW w:w="0" w:type="auto"/>
+        <w:jc w:val="center"/>
         <w:tblBorders>
           <w:top w:val="none" w:sz="0" w:space="0" w:color="auto"/>
           <w:left w:val="none" w:sz="0" w:space="0" w:color="auto"/>
@@ -1055,6 +1056,9 @@
         <w:gridCol w:w="3597"/>
       </w:tblGrid>
       <w:tr>
+        <w:trPr>
+          <w:jc w:val="center"/>
+        </w:trPr>
         <w:tc>
           <w:tcPr>
             <w:tcW w:w="3596" w:type="dxa"/>
@@ -1074,7 +1078,7 @@
                 <w:szCs w:val="22"/>
               </w:rPr>
               <w:drawing>
-                <wp:anchor distT="0" distB="0" distL="114300" distR="114300" simplePos="0" relativeHeight="251714560" behindDoc="0" locked="0" layoutInCell="1" allowOverlap="1" wp14:anchorId="7861A94A" wp14:editId="1EBB3246">
+                <wp:anchor distT="0" distB="0" distL="114300" distR="114300" simplePos="0" relativeHeight="251714560" behindDoc="0" locked="0" layoutInCell="1" allowOverlap="1" wp14:anchorId="7861A94A" wp14:editId="21F89B7B">
                   <wp:simplePos x="533400" y="762000"/>
                   <wp:positionH relativeFrom="margin">
                     <wp:align>center</wp:align>
@@ -1084,7 +1088,7 @@
                   </wp:positionV>
                   <wp:extent cx="1371600" cy="1371600"/>
                   <wp:effectExtent l="0" t="0" r="0" b="0"/>
-                  <wp:wrapSquare wrapText="bothSides"/>
+                  <wp:wrapTopAndBottom/>
                   <wp:docPr id="1498035790" name="Picture 8"/>
                   <wp:cNvGraphicFramePr>
                     <a:graphicFrameLocks xmlns:a="http://schemas.openxmlformats.org/drawingml/2006/main" noChangeAspect="1"/>
@@ -1167,7 +1171,7 @@
                 <w:szCs w:val="22"/>
               </w:rPr>
               <w:drawing>
-                <wp:anchor distT="0" distB="0" distL="114300" distR="114300" simplePos="0" relativeHeight="251715584" behindDoc="0" locked="0" layoutInCell="1" allowOverlap="1" wp14:anchorId="3D3CB7D7" wp14:editId="3667D5A0">
+                <wp:anchor distT="0" distB="0" distL="114300" distR="114300" simplePos="0" relativeHeight="251715584" behindDoc="0" locked="0" layoutInCell="1" allowOverlap="1" wp14:anchorId="3D3CB7D7" wp14:editId="2D318E92">
                   <wp:simplePos x="2809875" y="762000"/>
                   <wp:positionH relativeFrom="margin">
                     <wp:align>center</wp:align>
@@ -1177,7 +1181,7 @@
                   </wp:positionV>
                   <wp:extent cx="1371600" cy="1371600"/>
                   <wp:effectExtent l="0" t="0" r="0" b="0"/>
-                  <wp:wrapSquare wrapText="bothSides"/>
+                  <wp:wrapTopAndBottom/>
                   <wp:docPr id="277229442" name="Picture 9"/>
                   <wp:cNvGraphicFramePr>
                     <a:graphicFrameLocks xmlns:a="http://schemas.openxmlformats.org/drawingml/2006/main" noChangeAspect="1"/>
@@ -1247,6 +1251,7 @@
           </w:tcPr>
           <w:p>
             <w:pPr>
+              <w:jc w:val="center"/>
               <w:rPr>
                 <w:noProof/>
                 <w:sz w:val="22"/>
@@ -1260,7 +1265,7 @@
                 <w:szCs w:val="22"/>
               </w:rPr>
               <w:drawing>
-                <wp:anchor distT="0" distB="0" distL="114300" distR="114300" simplePos="0" relativeHeight="251716608" behindDoc="0" locked="0" layoutInCell="1" allowOverlap="1" wp14:anchorId="18873800" wp14:editId="518F83B7">
+                <wp:anchor distT="0" distB="0" distL="114300" distR="114300" simplePos="0" relativeHeight="251716608" behindDoc="1" locked="0" layoutInCell="1" allowOverlap="1" wp14:anchorId="18873800" wp14:editId="50A7B454">
                   <wp:simplePos x="5095875" y="762000"/>
                   <wp:positionH relativeFrom="margin">
                     <wp:align>center</wp:align>
@@ -1270,7 +1275,7 @@
                   </wp:positionV>
                   <wp:extent cx="1371600" cy="1371600"/>
                   <wp:effectExtent l="0" t="0" r="0" b="0"/>
-                  <wp:wrapSquare wrapText="bothSides"/>
+                  <wp:wrapTopAndBottom/>
                   <wp:docPr id="422324562" name="Picture 10"/>
                   <wp:cNvGraphicFramePr>
                     <a:graphicFrameLocks xmlns:a="http://schemas.openxmlformats.org/drawingml/2006/main" noChangeAspect="1"/>
@@ -1318,6 +1323,7 @@
           </w:p>
           <w:p>
             <w:pPr>
+              <w:jc w:val="center"/>
               <w:rPr>
                 <w:noProof/>
                 <w:sz w:val="22"/>
@@ -1330,20 +1336,12 @@
                 <w:sz w:val="22"/>
                 <w:szCs w:val="22"/>
               </w:rPr>
-              <w:t xml:space="preserve">            Report a Drone Incident</w:t>
+              <w:t>Report a Drone Incident</w:t>
             </w:r>
           </w:p>
           <w:p>
             <w:pPr>
-              <w:rPr>
-                <w:noProof/>
-                <w:sz w:val="22"/>
-                <w:szCs w:val="22"/>
-              </w:rPr>
-            </w:pPr>
-          </w:p>
-          <w:p>
-            <w:pPr>
+              <w:jc w:val="center"/>
               <w:rPr>
                 <w:noProof/>
                 <w:sz w:val="22"/>
@@ -1982,6 +1980,7 @@
   <w:style w:type="character" w:default="1" w:styleId="DefaultParagraphFont">
     <w:name w:val="Default Paragraph Font"/>
     <w:uiPriority w:val="1"/>
+    <w:semiHidden/>
     <w:unhideWhenUsed/>
   </w:style>
   <w:style w:type="table" w:default="1" w:styleId="TableNormal">

</xml_diff>